<commit_message>
feat(api): backup dashboard, resilient public API base URL, email bcc, template fixes
- add ADMIN-only backup module (/backup/health, /backup/snapshot) for DB health + full snapshot
- add resolvePublicApiBase util: prefer RAILWAY_PUBLIC_DOMAIN over stale PUBLIC_API_URL so old Railway links never get baked into PDFs/emails
- allow crm.galit.co.il origins in prod CORS
- support bcc when sending quote emails
- add googleapis dependency
- graph mail/pdf, quote-mail, quote-signature, pdf-convert, report-mail and docx-merge fixes
- refresh quote template .docx files

Co-Authored-By: Claude Opus 4.8 (1M context) <noreply@anthropic.com>
</commit_message>
<xml_diff>
--- a/apps/api/templates/example.docx
+++ b/apps/api/templates/example.docx
@@ -2472,23 +2472,12 @@
         </w:rPr>
       </w:pPr>
     </w:p>
-    <w:p>
-      <w:pPr>
-        <w:rPr>
-          <w:vanish/>
-        </w:rPr>
-      </w:pPr>
-      <w:r>
-        <w:rPr>
-          <w:vanish/>
-        </w:rPr>
-        <w:t xml:space="preserve">{#hasDiscount}</w:t>
-      </w:r>
-    </w:p>
     <w:tbl>
       <w:tblPr>
         <w:bidiVisual/>
         <w:tblW w:w="0" w:type="auto"/>
+        <w:tblLayout w:type="autofit"/>
+        <w:jc w:val="right"/>
         <w:tblBorders>
           <w:top w:val="single" w:sz="4" w:space="0" w:color="auto"/>
           <w:left w:val="single" w:sz="4" w:space="0" w:color="auto"/>
@@ -2500,18 +2489,18 @@
         <w:tblLook w:val="04A0" w:firstRow="1" w:lastRow="0" w:firstColumn="1" w:lastColumn="0" w:noHBand="0" w:noVBand="1"/>
       </w:tblPr>
       <w:tblGrid>
-        <w:gridCol w:w="911"/>
-        <w:gridCol w:w="911"/>
-        <w:gridCol w:w="3142"/>
-        <w:gridCol w:w="851"/>
-        <w:gridCol w:w="1177"/>
-        <w:gridCol w:w="1073"/>
-        <w:gridCol w:w="1764"/>
+        <w:gridCol/>
+        <w:gridCol/>
+        <w:gridCol/>
+        <w:gridCol/>
+        <w:gridCol/>
+        <w:gridCol/>
+        <w:gridCol/>
       </w:tblGrid>
       <w:tr>
         <w:tc>
           <w:tcPr>
-            <w:tcW w:w="911" w:type="dxa"/>
+            <w:tcW w:w="0" w:type="auto"/>
           </w:tcPr>
           <w:p>
             <w:pPr>
@@ -2539,7 +2528,7 @@
         </w:tc>
         <w:tc>
           <w:tcPr>
-            <w:tcW w:w="911" w:type="dxa"/>
+            <w:tcW w:w="0" w:type="auto"/>
           </w:tcPr>
           <w:p>
             <w:pPr>
@@ -2567,7 +2556,7 @@
         </w:tc>
         <w:tc>
           <w:tcPr>
-            <w:tcW w:w="3142" w:type="dxa"/>
+            <w:tcW w:w="0" w:type="auto"/>
           </w:tcPr>
           <w:p>
             <w:pPr>
@@ -2595,7 +2584,7 @@
         </w:tc>
         <w:tc>
           <w:tcPr>
-            <w:tcW w:w="851" w:type="dxa"/>
+            <w:tcW w:w="0" w:type="auto"/>
           </w:tcPr>
           <w:p>
             <w:pPr>
@@ -2623,7 +2612,7 @@
         </w:tc>
         <w:tc>
           <w:tcPr>
-            <w:tcW w:w="1177" w:type="dxa"/>
+            <w:tcW w:w="0" w:type="auto"/>
           </w:tcPr>
           <w:p>
             <w:pPr>
@@ -2651,7 +2640,7 @@
         </w:tc>
         <w:tc>
           <w:tcPr>
-            <w:tcW w:w="1073" w:type="dxa"/>
+            <w:tcW w:w="0" w:type="auto"/>
           </w:tcPr>
           <w:p>
             <w:pPr>
@@ -2679,7 +2668,7 @@
         </w:tc>
         <w:tc>
           <w:tcPr>
-            <w:tcW w:w="1764" w:type="dxa"/>
+            <w:tcW w:w="0" w:type="auto"/>
           </w:tcPr>
           <w:p>
             <w:pPr>
@@ -2721,7 +2710,7 @@
       <w:tr>
         <w:tc>
           <w:tcPr>
-            <w:tcW w:w="911" w:type="dxa"/>
+            <w:tcW w:w="0" w:type="auto"/>
           </w:tcPr>
           <w:p>
             <w:pPr>
@@ -2734,6 +2723,8 @@
                 <w:rtl/>
               </w:rPr>
             </w:pPr>
+            <w:bookmarkStart w:id="7" w:name="fldLine"/>
+            <w:bookmarkEnd w:id="7"/>
             <w:r>
               <w:rPr>
                 <w:rFonts w:cs="David" w:hint="cs"/>
@@ -2743,13 +2734,13 @@
                 <w:szCs w:val="28"/>
                 <w:rtl/>
               </w:rPr>
-              <w:t xml:space="preserve">{#items}{lineNumber}</w:t>
+              <w:t>{#items}{lineNumber}</w:t>
             </w:r>
           </w:p>
         </w:tc>
         <w:tc>
           <w:tcPr>
-            <w:tcW w:w="911" w:type="dxa"/>
+            <w:tcW w:w="0" w:type="auto"/>
           </w:tcPr>
           <w:p>
             <w:pPr>
@@ -2777,7 +2768,7 @@
         </w:tc>
         <w:tc>
           <w:tcPr>
-            <w:tcW w:w="3142" w:type="dxa"/>
+            <w:tcW w:w="0" w:type="auto"/>
           </w:tcPr>
           <w:p>
             <w:pPr>
@@ -2805,7 +2796,7 @@
         </w:tc>
         <w:tc>
           <w:tcPr>
-            <w:tcW w:w="851" w:type="dxa"/>
+            <w:tcW w:w="0" w:type="auto"/>
           </w:tcPr>
           <w:p>
             <w:pPr>
@@ -2833,7 +2824,7 @@
         </w:tc>
         <w:tc>
           <w:tcPr>
-            <w:tcW w:w="1177" w:type="dxa"/>
+            <w:tcW w:w="0" w:type="auto"/>
           </w:tcPr>
           <w:p>
             <w:pPr>
@@ -2861,7 +2852,7 @@
         </w:tc>
         <w:tc>
           <w:tcPr>
-            <w:tcW w:w="1073" w:type="dxa"/>
+            <w:tcW w:w="0" w:type="auto"/>
           </w:tcPr>
           <w:p>
             <w:pPr>
@@ -2889,7 +2880,7 @@
         </w:tc>
         <w:tc>
           <w:tcPr>
-            <w:tcW w:w="1764" w:type="dxa"/>
+            <w:tcW w:w="0" w:type="auto"/>
           </w:tcPr>
           <w:p>
             <w:pPr>
@@ -2899,7 +2890,6 @@
                 <w:bCs/>
                 <w:sz w:val="28"/>
                 <w:szCs w:val="28"/>
-                <w:rtl/>
               </w:rPr>
             </w:pPr>
             <w:r>
@@ -2917,18 +2907,14 @@
         </w:tc>
       </w:tr>
     </w:tbl>
-    <w:p>
-      <w:pPr>
-        <w:rPr>
-          <w:vanish/>
-        </w:rPr>
-      </w:pPr>
-    </w:p>
+    <w:p/>
+    <w:p/>
     <w:tbl>
       <w:tblPr>
-        <w:tblpPr w:leftFromText="180" w:rightFromText="180" w:vertAnchor="text" w:horzAnchor="page" w:tblpX="1340" w:tblpY="199"/>
         <w:bidiVisual/>
         <w:tblW w:w="0" w:type="auto"/>
+        <w:tblLayout w:type="autofit"/>
+        <w:jc w:val="right"/>
         <w:tblBorders>
           <w:top w:val="single" w:sz="4" w:space="0" w:color="auto"/>
           <w:left w:val="single" w:sz="4" w:space="0" w:color="auto"/>
@@ -2940,13 +2926,13 @@
         <w:tblLook w:val="04A0" w:firstRow="1" w:lastRow="0" w:firstColumn="1" w:lastColumn="0" w:noHBand="0" w:noVBand="1"/>
       </w:tblPr>
       <w:tblGrid>
-        <w:gridCol w:w="1764"/>
-        <w:gridCol w:w="1764"/>
+        <w:gridCol/>
+        <w:gridCol/>
       </w:tblGrid>
       <w:tr>
         <w:tc>
           <w:tcPr>
-            <w:tcW w:w="1764" w:type="dxa"/>
+            <w:tcW w:w="0" w:type="auto"/>
           </w:tcPr>
           <w:p>
             <w:pPr>
@@ -2985,7 +2971,7 @@
         </w:tc>
         <w:tc>
           <w:tcPr>
-            <w:tcW w:w="1764" w:type="dxa"/>
+            <w:tcW w:w="0" w:type="auto"/>
           </w:tcPr>
           <w:p>
             <w:pPr>
@@ -3015,7 +3001,7 @@
       <w:tr>
         <w:tc>
           <w:tcPr>
-            <w:tcW w:w="1764" w:type="dxa"/>
+            <w:tcW w:w="0" w:type="auto"/>
           </w:tcPr>
           <w:p>
             <w:pPr>
@@ -3043,7 +3029,7 @@
         </w:tc>
         <w:tc>
           <w:tcPr>
-            <w:tcW w:w="1764" w:type="dxa"/>
+            <w:tcW w:w="0" w:type="auto"/>
           </w:tcPr>
           <w:p>
             <w:pPr>
@@ -3073,7 +3059,7 @@
       <w:tr>
         <w:tc>
           <w:tcPr>
-            <w:tcW w:w="1764" w:type="dxa"/>
+            <w:tcW w:w="0" w:type="auto"/>
           </w:tcPr>
           <w:p>
             <w:pPr>
@@ -3123,7 +3109,7 @@
         </w:tc>
         <w:tc>
           <w:tcPr>
-            <w:tcW w:w="1764" w:type="dxa"/>
+            <w:tcW w:w="0" w:type="auto"/>
           </w:tcPr>
           <w:p>
             <w:pPr>
@@ -3153,7 +3139,7 @@
       <w:tr>
         <w:tc>
           <w:tcPr>
-            <w:tcW w:w="1764" w:type="dxa"/>
+            <w:tcW w:w="0" w:type="auto"/>
           </w:tcPr>
           <w:p>
             <w:pPr>
@@ -3181,7 +3167,7 @@
         </w:tc>
         <w:tc>
           <w:tcPr>
-            <w:tcW w:w="1764" w:type="dxa"/>
+            <w:tcW w:w="0" w:type="auto"/>
           </w:tcPr>
           <w:p>
             <w:pPr>
@@ -3209,743 +3195,6 @@
         </w:tc>
       </w:tr>
     </w:tbl>
-    <w:p>
-      <w:pPr>
-        <w:rPr>
-          <w:vanish/>
-        </w:rPr>
-      </w:pPr>
-      <w:r>
-        <w:rPr>
-          <w:vanish/>
-        </w:rPr>
-        <w:t xml:space="preserve">{/hasDiscount}</w:t>
-      </w:r>
-    </w:p>
-    <w:p>
-      <w:pPr>
-        <w:rPr>
-          <w:rFonts w:cs="David"/>
-          <w:sz w:val="28"/>
-          <w:szCs w:val="28"/>
-          <w:rtl/>
-        </w:rPr>
-      </w:pPr>
-    </w:p>
-    <w:p>
-      <w:pPr>
-        <w:rPr>
-          <w:rFonts w:cs="David"/>
-          <w:sz w:val="28"/>
-          <w:szCs w:val="28"/>
-          <w:rtl/>
-        </w:rPr>
-      </w:pPr>
-    </w:p>
-    <w:p>
-      <w:pPr>
-        <w:rPr>
-          <w:rFonts w:cs="David"/>
-          <w:sz w:val="28"/>
-          <w:szCs w:val="28"/>
-          <w:rtl/>
-        </w:rPr>
-      </w:pPr>
-    </w:p>
-    <w:p>
-      <w:pPr>
-        <w:rPr>
-          <w:rFonts w:cs="David"/>
-          <w:sz w:val="28"/>
-          <w:szCs w:val="28"/>
-          <w:rtl/>
-        </w:rPr>
-      </w:pPr>
-    </w:p>
-    <w:p>
-      <w:pPr>
-        <w:rPr>
-          <w:rFonts w:cs="David"/>
-          <w:sz w:val="28"/>
-          <w:szCs w:val="28"/>
-          <w:rtl/>
-        </w:rPr>
-      </w:pPr>
-    </w:p>
-    <w:p>
-      <w:pPr>
-        <w:rPr>
-          <w:rFonts w:cs="David"/>
-          <w:sz w:val="28"/>
-          <w:szCs w:val="28"/>
-          <w:rtl/>
-        </w:rPr>
-      </w:pPr>
-    </w:p>
-    <w:p>
-      <w:pPr>
-        <w:rPr>
-          <w:rFonts w:cs="David"/>
-          <w:sz w:val="28"/>
-          <w:szCs w:val="28"/>
-          <w:rtl/>
-        </w:rPr>
-      </w:pPr>
-    </w:p>
-    <w:p>
-      <w:pPr>
-        <w:rPr>
-          <w:rFonts w:cs="David"/>
-          <w:sz w:val="28"/>
-          <w:szCs w:val="28"/>
-          <w:rtl/>
-        </w:rPr>
-      </w:pPr>
-    </w:p>
-    <w:p>
-      <w:pPr>
-        <w:rPr>
-          <w:rFonts w:cs="David"/>
-          <w:sz w:val="28"/>
-          <w:szCs w:val="28"/>
-          <w:rtl/>
-        </w:rPr>
-      </w:pPr>
-    </w:p>
-    <w:p>
-      <w:pPr>
-        <w:rPr>
-          <w:rFonts w:cs="David"/>
-          <w:sz w:val="28"/>
-          <w:szCs w:val="28"/>
-          <w:rtl/>
-        </w:rPr>
-      </w:pPr>
-    </w:p>
-    <w:p>
-      <w:pPr>
-        <w:rPr>
-          <w:vanish/>
-        </w:rPr>
-      </w:pPr>
-      <w:r>
-        <w:rPr>
-          <w:vanish/>
-        </w:rPr>
-        <w:t xml:space="preserve">{^hasDiscount}</w:t>
-      </w:r>
-    </w:p>
-    <w:tbl>
-      <w:tblPr>
-        <w:bidiVisual/>
-        <w:tblW w:w="0" w:type="auto"/>
-        <w:tblBorders>
-          <w:top w:val="single" w:sz="4" w:space="0" w:color="auto"/>
-          <w:left w:val="single" w:sz="4" w:space="0" w:color="auto"/>
-          <w:bottom w:val="single" w:sz="4" w:space="0" w:color="auto"/>
-          <w:right w:val="single" w:sz="4" w:space="0" w:color="auto"/>
-          <w:insideH w:val="single" w:sz="4" w:space="0" w:color="auto"/>
-          <w:insideV w:val="single" w:sz="4" w:space="0" w:color="auto"/>
-        </w:tblBorders>
-        <w:tblLook w:val="04A0" w:firstRow="1" w:lastRow="0" w:firstColumn="1" w:lastColumn="0" w:noHBand="0" w:noVBand="1"/>
-      </w:tblPr>
-      <w:tblGrid>
-        <w:gridCol w:w="911"/>
-        <w:gridCol w:w="911"/>
-        <w:gridCol w:w="3142"/>
-        <w:gridCol w:w="851"/>
-        <w:gridCol w:w="1177"/>
-        <w:gridCol w:w="1764"/>
-      </w:tblGrid>
-      <w:tr>
-        <w:tc>
-          <w:tcPr>
-            <w:tcW w:w="911" w:type="dxa"/>
-          </w:tcPr>
-          <w:p>
-            <w:pPr>
-              <w:rPr>
-                <w:rFonts w:cs="David"/>
-                <w:b/>
-                <w:bCs/>
-                <w:sz w:val="28"/>
-                <w:szCs w:val="28"/>
-                <w:rtl/>
-              </w:rPr>
-            </w:pPr>
-            <w:r>
-              <w:rPr>
-                <w:rFonts w:cs="David" w:hint="cs"/>
-                <w:b/>
-                <w:bCs/>
-                <w:sz w:val="28"/>
-                <w:szCs w:val="28"/>
-                <w:rtl/>
-              </w:rPr>
-              <w:t>שורה</w:t>
-            </w:r>
-          </w:p>
-        </w:tc>
-        <w:tc>
-          <w:tcPr>
-            <w:tcW w:w="911" w:type="dxa"/>
-          </w:tcPr>
-          <w:p>
-            <w:pPr>
-              <w:rPr>
-                <w:rFonts w:cs="David"/>
-                <w:b/>
-                <w:bCs/>
-                <w:sz w:val="28"/>
-                <w:szCs w:val="28"/>
-                <w:rtl/>
-              </w:rPr>
-            </w:pPr>
-            <w:r>
-              <w:rPr>
-                <w:rFonts w:cs="David" w:hint="cs"/>
-                <w:b/>
-                <w:bCs/>
-                <w:sz w:val="28"/>
-                <w:szCs w:val="28"/>
-                <w:rtl/>
-              </w:rPr>
-              <w:t xml:space="preserve">מק"ט </w:t>
-            </w:r>
-          </w:p>
-        </w:tc>
-        <w:tc>
-          <w:tcPr>
-            <w:tcW w:w="3142" w:type="dxa"/>
-          </w:tcPr>
-          <w:p>
-            <w:pPr>
-              <w:rPr>
-                <w:rFonts w:cs="David"/>
-                <w:b/>
-                <w:bCs/>
-                <w:sz w:val="28"/>
-                <w:szCs w:val="28"/>
-                <w:rtl/>
-              </w:rPr>
-            </w:pPr>
-            <w:r>
-              <w:rPr>
-                <w:rFonts w:cs="David" w:hint="cs"/>
-                <w:b/>
-                <w:bCs/>
-                <w:sz w:val="28"/>
-                <w:szCs w:val="28"/>
-                <w:rtl/>
-              </w:rPr>
-              <w:t>תיאור המוצר</w:t>
-            </w:r>
-          </w:p>
-        </w:tc>
-        <w:tc>
-          <w:tcPr>
-            <w:tcW w:w="851" w:type="dxa"/>
-          </w:tcPr>
-          <w:p>
-            <w:pPr>
-              <w:rPr>
-                <w:rFonts w:cs="David"/>
-                <w:b/>
-                <w:bCs/>
-                <w:sz w:val="28"/>
-                <w:szCs w:val="28"/>
-                <w:rtl/>
-              </w:rPr>
-            </w:pPr>
-            <w:r>
-              <w:rPr>
-                <w:rFonts w:cs="David" w:hint="cs"/>
-                <w:b/>
-                <w:bCs/>
-                <w:sz w:val="28"/>
-                <w:szCs w:val="28"/>
-                <w:rtl/>
-              </w:rPr>
-              <w:t>כמות</w:t>
-            </w:r>
-          </w:p>
-        </w:tc>
-        <w:tc>
-          <w:tcPr>
-            <w:tcW w:w="1177" w:type="dxa"/>
-          </w:tcPr>
-          <w:p>
-            <w:pPr>
-              <w:rPr>
-                <w:rFonts w:cs="David"/>
-                <w:b/>
-                <w:bCs/>
-                <w:sz w:val="28"/>
-                <w:szCs w:val="28"/>
-                <w:rtl/>
-              </w:rPr>
-            </w:pPr>
-            <w:r>
-              <w:rPr>
-                <w:rFonts w:cs="David" w:hint="cs"/>
-                <w:b/>
-                <w:bCs/>
-                <w:sz w:val="28"/>
-                <w:szCs w:val="28"/>
-                <w:rtl/>
-              </w:rPr>
-              <w:t>מחיר ליחידה</w:t>
-            </w:r>
-          </w:p>
-        </w:tc>
-        <w:tc>
-          <w:tcPr>
-            <w:tcW w:w="1764" w:type="dxa"/>
-          </w:tcPr>
-          <w:p>
-            <w:pPr>
-              <w:rPr>
-                <w:rFonts w:cs="David"/>
-                <w:b/>
-                <w:bCs/>
-                <w:sz w:val="28"/>
-                <w:szCs w:val="28"/>
-                <w:rtl/>
-              </w:rPr>
-            </w:pPr>
-            <w:r>
-              <w:rPr>
-                <w:rFonts w:cs="David" w:hint="cs"/>
-                <w:b/>
-                <w:bCs/>
-                <w:sz w:val="28"/>
-                <w:szCs w:val="28"/>
-                <w:rtl/>
-              </w:rPr>
-              <w:t>סה"כ ₪</w:t>
-            </w:r>
-          </w:p>
-          <w:p>
-            <w:pPr>
-              <w:rPr>
-                <w:rFonts w:cs="David"/>
-                <w:b/>
-                <w:bCs/>
-                <w:sz w:val="28"/>
-                <w:szCs w:val="28"/>
-                <w:rtl/>
-              </w:rPr>
-            </w:pPr>
-          </w:p>
-        </w:tc>
-      </w:tr>
-      <w:tr>
-        <w:tc>
-          <w:tcPr>
-            <w:tcW w:w="911" w:type="dxa"/>
-          </w:tcPr>
-          <w:p>
-            <w:pPr>
-              <w:rPr>
-                <w:rFonts w:cs="David"/>
-                <w:b/>
-                <w:bCs/>
-                <w:sz w:val="28"/>
-                <w:szCs w:val="28"/>
-                <w:rtl/>
-              </w:rPr>
-            </w:pPr>
-            <w:r>
-              <w:rPr>
-                <w:rFonts w:cs="David" w:hint="cs"/>
-                <w:b/>
-                <w:bCs/>
-                <w:sz w:val="28"/>
-                <w:szCs w:val="28"/>
-                <w:rtl/>
-              </w:rPr>
-              <w:t xml:space="preserve">{#items}{lineNumber}</w:t>
-            </w:r>
-          </w:p>
-        </w:tc>
-        <w:tc>
-          <w:tcPr>
-            <w:tcW w:w="911" w:type="dxa"/>
-          </w:tcPr>
-          <w:p>
-            <w:pPr>
-              <w:rPr>
-                <w:rFonts w:cs="David"/>
-                <w:b/>
-                <w:bCs/>
-                <w:sz w:val="28"/>
-                <w:szCs w:val="28"/>
-                <w:rtl/>
-              </w:rPr>
-            </w:pPr>
-            <w:r>
-              <w:rPr>
-                <w:rFonts w:cs="David" w:hint="cs"/>
-                <w:b/>
-                <w:bCs/>
-                <w:sz w:val="28"/>
-                <w:szCs w:val="28"/>
-                <w:rtl/>
-              </w:rPr>
-              <w:t xml:space="preserve">{itemCode}</w:t>
-            </w:r>
-          </w:p>
-        </w:tc>
-        <w:tc>
-          <w:tcPr>
-            <w:tcW w:w="3142" w:type="dxa"/>
-          </w:tcPr>
-          <w:p>
-            <w:pPr>
-              <w:rPr>
-                <w:rFonts w:cs="David"/>
-                <w:b/>
-                <w:bCs/>
-                <w:sz w:val="28"/>
-                <w:szCs w:val="28"/>
-                <w:rtl/>
-              </w:rPr>
-            </w:pPr>
-            <w:r>
-              <w:rPr>
-                <w:rFonts w:cs="David" w:hint="cs"/>
-                <w:b/>
-                <w:bCs/>
-                <w:sz w:val="28"/>
-                <w:szCs w:val="28"/>
-                <w:rtl/>
-              </w:rPr>
-              <w:t xml:space="preserve">{description}</w:t>
-            </w:r>
-          </w:p>
-        </w:tc>
-        <w:tc>
-          <w:tcPr>
-            <w:tcW w:w="851" w:type="dxa"/>
-          </w:tcPr>
-          <w:p>
-            <w:pPr>
-              <w:rPr>
-                <w:rFonts w:cs="David"/>
-                <w:b/>
-                <w:bCs/>
-                <w:sz w:val="28"/>
-                <w:szCs w:val="28"/>
-                <w:rtl/>
-              </w:rPr>
-            </w:pPr>
-            <w:r>
-              <w:rPr>
-                <w:rFonts w:cs="David" w:hint="cs"/>
-                <w:b/>
-                <w:bCs/>
-                <w:sz w:val="28"/>
-                <w:szCs w:val="28"/>
-                <w:rtl/>
-              </w:rPr>
-              <w:t xml:space="preserve">{quantity}</w:t>
-            </w:r>
-          </w:p>
-        </w:tc>
-        <w:tc>
-          <w:tcPr>
-            <w:tcW w:w="1177" w:type="dxa"/>
-          </w:tcPr>
-          <w:p>
-            <w:pPr>
-              <w:rPr>
-                <w:rFonts w:cs="David"/>
-                <w:b/>
-                <w:bCs/>
-                <w:sz w:val="28"/>
-                <w:szCs w:val="28"/>
-                <w:rtl/>
-              </w:rPr>
-            </w:pPr>
-            <w:r>
-              <w:rPr>
-                <w:rFonts w:cs="David" w:hint="cs"/>
-                <w:b/>
-                <w:bCs/>
-                <w:sz w:val="28"/>
-                <w:szCs w:val="28"/>
-                <w:rtl/>
-              </w:rPr>
-              <w:t xml:space="preserve">{unitPrice}</w:t>
-            </w:r>
-          </w:p>
-        </w:tc>
-        <w:tc>
-          <w:tcPr>
-            <w:tcW w:w="1764" w:type="dxa"/>
-          </w:tcPr>
-          <w:p>
-            <w:pPr>
-              <w:rPr>
-                <w:rFonts w:cs="David" w:hint="cs"/>
-                <w:b/>
-                <w:bCs/>
-                <w:sz w:val="28"/>
-                <w:szCs w:val="28"/>
-                <w:rtl/>
-              </w:rPr>
-            </w:pPr>
-            <w:r>
-              <w:rPr>
-                <w:rFonts w:cs="David" w:hint="cs"/>
-                <w:b/>
-                <w:bCs/>
-                <w:sz w:val="28"/>
-                <w:szCs w:val="28"/>
-                <w:rtl/>
-              </w:rPr>
-              <w:t xml:space="preserve">{lineTotal}{/items}</w:t>
-            </w:r>
-          </w:p>
-        </w:tc>
-      </w:tr>
-    </w:tbl>
-    <w:p>
-      <w:pPr>
-        <w:rPr>
-          <w:vanish/>
-        </w:rPr>
-      </w:pPr>
-    </w:p>
-    <w:tbl>
-      <w:tblPr>
-        <w:tblpPr w:leftFromText="180" w:rightFromText="180" w:vertAnchor="text" w:horzAnchor="page" w:tblpX="2434" w:tblpY="249"/>
-        <w:bidiVisual/>
-        <w:tblW w:w="0" w:type="auto"/>
-        <w:tblBorders>
-          <w:top w:val="single" w:sz="4" w:space="0" w:color="auto"/>
-          <w:left w:val="single" w:sz="4" w:space="0" w:color="auto"/>
-          <w:bottom w:val="single" w:sz="4" w:space="0" w:color="auto"/>
-          <w:right w:val="single" w:sz="4" w:space="0" w:color="auto"/>
-          <w:insideH w:val="single" w:sz="4" w:space="0" w:color="auto"/>
-          <w:insideV w:val="single" w:sz="4" w:space="0" w:color="auto"/>
-        </w:tblBorders>
-        <w:tblLook w:val="04A0" w:firstRow="1" w:lastRow="0" w:firstColumn="1" w:lastColumn="0" w:noHBand="0" w:noVBand="1"/>
-      </w:tblPr>
-      <w:tblGrid>
-        <w:gridCol w:w="1764"/>
-        <w:gridCol w:w="1764"/>
-      </w:tblGrid>
-      <w:tr>
-        <w:tc>
-          <w:tcPr>
-            <w:tcW w:w="1764" w:type="dxa"/>
-          </w:tcPr>
-          <w:p>
-            <w:pPr>
-              <w:rPr>
-                <w:rFonts w:cs="David"/>
-                <w:b/>
-                <w:bCs/>
-                <w:sz w:val="28"/>
-                <w:szCs w:val="28"/>
-                <w:rtl/>
-              </w:rPr>
-            </w:pPr>
-            <w:r>
-              <w:rPr>
-                <w:rFonts w:cs="David" w:hint="cs"/>
-                <w:b/>
-                <w:bCs/>
-                <w:sz w:val="28"/>
-                <w:szCs w:val="28"/>
-                <w:rtl/>
-              </w:rPr>
-              <w:t>סה"כ</w:t>
-            </w:r>
-          </w:p>
-        </w:tc>
-        <w:tc>
-          <w:tcPr>
-            <w:tcW w:w="1764" w:type="dxa"/>
-          </w:tcPr>
-          <w:p>
-            <w:pPr>
-              <w:rPr>
-                <w:rFonts w:cs="David"/>
-                <w:b/>
-                <w:bCs/>
-                <w:sz w:val="28"/>
-                <w:szCs w:val="28"/>
-                <w:rtl/>
-              </w:rPr>
-            </w:pPr>
-            <w:r>
-              <w:rPr>
-                <w:rFonts w:cs="David" w:hint="cs"/>
-                <w:b/>
-                <w:bCs/>
-                <w:sz w:val="28"/>
-                <w:szCs w:val="28"/>
-                <w:rtl/>
-              </w:rPr>
-              <w:t xml:space="preserve">{subtotalAfterDiscount}</w:t>
-            </w:r>
-          </w:p>
-        </w:tc>
-      </w:tr>
-      <w:tr>
-        <w:tc>
-          <w:tcPr>
-            <w:tcW w:w="1764" w:type="dxa"/>
-          </w:tcPr>
-          <w:p>
-            <w:pPr>
-              <w:rPr>
-                <w:rFonts w:cs="David"/>
-                <w:b/>
-                <w:bCs/>
-                <w:sz w:val="28"/>
-                <w:szCs w:val="28"/>
-                <w:rtl/>
-              </w:rPr>
-            </w:pPr>
-            <w:r>
-              <w:rPr>
-                <w:rFonts w:cs="David" w:hint="cs"/>
-                <w:b/>
-                <w:bCs/>
-                <w:sz w:val="28"/>
-                <w:szCs w:val="28"/>
-                <w:rtl/>
-              </w:rPr>
-              <w:t>מע"מ 1</w:t>
-            </w:r>
-            <w:r>
-              <w:rPr>
-                <w:rFonts w:cs="David" w:hint="cs"/>
-                <w:b/>
-                <w:bCs/>
-                <w:sz w:val="28"/>
-                <w:szCs w:val="28"/>
-                <w:rtl/>
-              </w:rPr>
-              <w:t>8</w:t>
-            </w:r>
-            <w:r>
-              <w:rPr>
-                <w:rFonts w:cs="David" w:hint="cs"/>
-                <w:b/>
-                <w:bCs/>
-                <w:sz w:val="28"/>
-                <w:szCs w:val="28"/>
-                <w:rtl/>
-              </w:rPr>
-              <w:t>%</w:t>
-            </w:r>
-          </w:p>
-        </w:tc>
-        <w:tc>
-          <w:tcPr>
-            <w:tcW w:w="1764" w:type="dxa"/>
-          </w:tcPr>
-          <w:p>
-            <w:pPr>
-              <w:rPr>
-                <w:rFonts w:cs="David"/>
-                <w:b/>
-                <w:bCs/>
-                <w:sz w:val="28"/>
-                <w:szCs w:val="28"/>
-                <w:rtl/>
-              </w:rPr>
-            </w:pPr>
-            <w:r>
-              <w:rPr>
-                <w:rFonts w:cs="David" w:hint="cs"/>
-                <w:b/>
-                <w:bCs/>
-                <w:sz w:val="28"/>
-                <w:szCs w:val="28"/>
-                <w:rtl/>
-              </w:rPr>
-              <w:t xml:space="preserve">{vatAmount}</w:t>
-            </w:r>
-          </w:p>
-        </w:tc>
-      </w:tr>
-      <w:tr>
-        <w:tc>
-          <w:tcPr>
-            <w:tcW w:w="1764" w:type="dxa"/>
-          </w:tcPr>
-          <w:p>
-            <w:pPr>
-              <w:rPr>
-                <w:rFonts w:cs="David"/>
-                <w:b/>
-                <w:bCs/>
-                <w:sz w:val="28"/>
-                <w:szCs w:val="28"/>
-                <w:rtl/>
-              </w:rPr>
-            </w:pPr>
-            <w:r>
-              <w:rPr>
-                <w:rFonts w:cs="David" w:hint="cs"/>
-                <w:b/>
-                <w:bCs/>
-                <w:sz w:val="28"/>
-                <w:szCs w:val="28"/>
-                <w:rtl/>
-              </w:rPr>
-              <w:t xml:space="preserve">סה"כ לתשלום </w:t>
-            </w:r>
-          </w:p>
-        </w:tc>
-        <w:tc>
-          <w:tcPr>
-            <w:tcW w:w="1764" w:type="dxa"/>
-          </w:tcPr>
-          <w:p>
-            <w:pPr>
-              <w:rPr>
-                <w:rFonts w:cs="David"/>
-                <w:b/>
-                <w:bCs/>
-                <w:sz w:val="28"/>
-                <w:szCs w:val="28"/>
-                <w:rtl/>
-              </w:rPr>
-            </w:pPr>
-            <w:r>
-              <w:rPr>
-                <w:rFonts w:cs="David" w:hint="cs"/>
-                <w:b/>
-                <w:bCs/>
-                <w:sz w:val="28"/>
-                <w:szCs w:val="28"/>
-                <w:rtl/>
-              </w:rPr>
-              <w:t xml:space="preserve">{totalAmount}</w:t>
-            </w:r>
-          </w:p>
-        </w:tc>
-      </w:tr>
-    </w:tbl>
-    <w:p>
-      <w:pPr>
-        <w:rPr>
-          <w:vanish/>
-        </w:rPr>
-      </w:pPr>
-      <w:r>
-        <w:rPr>
-          <w:vanish/>
-        </w:rPr>
-        <w:t xml:space="preserve">{/hasDiscount}</w:t>
-      </w:r>
-    </w:p>
     <w:p>
       <w:pPr>
         <w:rPr>

</xml_diff>